<commit_message>
Fin de a~o C++
</commit_message>
<xml_diff>
--- a/c++/c++2/sem2/codec/index.docx
+++ b/c++/c++2/sem2/codec/index.docx
@@ -602,7 +602,12 @@
         </w:rPr>
       </w:pPr>
       <w:r>
-        <w:rPr/>
+        <w:rPr>
+          <w:b w:val="false"/>
+          <w:bCs w:val="false"/>
+          <w:sz w:val="22"/>
+          <w:szCs w:val="22"/>
+        </w:rPr>
       </w:r>
     </w:p>
     <w:p>
@@ -620,8 +625,16 @@
           <w:sz w:val="22"/>
           <w:szCs w:val="22"/>
         </w:rPr>
-        <w:t xml:space="preserve">1. </w:t>
-      </w:r>
+        <w:t>1. ¿Cuál es la diferencia entre los arreglos unidimensionales y los arreglos multidimensionales?</w:t>
+      </w:r>
+    </w:p>
+    <w:p>
+      <w:pPr>
+        <w:pStyle w:val="BodyText"/>
+        <w:bidi w:val="0"/>
+        <w:jc w:val="start"/>
+        <w:rPr/>
+      </w:pPr>
       <w:r>
         <w:rPr>
           <w:rStyle w:val="Strong"/>
@@ -630,7 +643,7 @@
           <w:sz w:val="22"/>
           <w:szCs w:val="22"/>
         </w:rPr>
-        <w:t>¿Cuál es la diferencia entre los arreglos unidimensionales y los arreglos multidimensionales?</w:t>
+        <w:t>2. ¿Es lo mismo referirse a un arreglo bidimensional como arreglo multidimensional?</w:t>
       </w:r>
     </w:p>
     <w:p>
@@ -648,8 +661,16 @@
           <w:sz w:val="22"/>
           <w:szCs w:val="22"/>
         </w:rPr>
-        <w:t xml:space="preserve">2. </w:t>
-      </w:r>
+        <w:t>3. ¿En qué tipo de situaciones son útiles los arreglos unidimensionales y en qué tipo de situaciones son</w:t>
+      </w:r>
+    </w:p>
+    <w:p>
+      <w:pPr>
+        <w:pStyle w:val="BodyText"/>
+        <w:bidi w:val="0"/>
+        <w:jc w:val="start"/>
+        <w:rPr/>
+      </w:pPr>
       <w:r>
         <w:rPr>
           <w:rStyle w:val="Strong"/>
@@ -658,52 +679,6 @@
           <w:sz w:val="22"/>
           <w:szCs w:val="22"/>
         </w:rPr>
-        <w:t>¿Es lo mismo referirse a un arreglo bidimensional como arreglo multidimensional?</w:t>
-      </w:r>
-    </w:p>
-    <w:p>
-      <w:pPr>
-        <w:pStyle w:val="BodyText"/>
-        <w:bidi w:val="0"/>
-        <w:jc w:val="start"/>
-        <w:rPr/>
-      </w:pPr>
-      <w:r>
-        <w:rPr>
-          <w:rStyle w:val="Strong"/>
-          <w:b w:val="false"/>
-          <w:bCs w:val="false"/>
-          <w:sz w:val="22"/>
-          <w:szCs w:val="22"/>
-        </w:rPr>
-        <w:t>3.</w:t>
-      </w:r>
-      <w:r>
-        <w:rPr>
-          <w:rStyle w:val="Strong"/>
-          <w:b w:val="false"/>
-          <w:bCs w:val="false"/>
-          <w:sz w:val="22"/>
-          <w:szCs w:val="22"/>
-        </w:rPr>
-        <w:t xml:space="preserve"> ¿En qué tipo de situaciones son útiles los arreglos unidimensionales y en qué tipo de situaciones son</w:t>
-      </w:r>
-    </w:p>
-    <w:p>
-      <w:pPr>
-        <w:pStyle w:val="BodyText"/>
-        <w:bidi w:val="0"/>
-        <w:jc w:val="start"/>
-        <w:rPr/>
-      </w:pPr>
-      <w:r>
-        <w:rPr>
-          <w:rStyle w:val="Strong"/>
-          <w:b w:val="false"/>
-          <w:bCs w:val="false"/>
-          <w:sz w:val="22"/>
-          <w:szCs w:val="22"/>
-        </w:rPr>
         <w:t>útiles los arreglos multidimensionales?</w:t>
       </w:r>
     </w:p>
@@ -734,11 +709,74 @@
       <w:pPr>
         <w:pStyle w:val="Normal"/>
         <w:bidi w:val="0"/>
-        <w:jc w:val="start"/>
-        <w:rPr/>
-      </w:pPr>
-      <w:r>
-        <w:rPr/>
+        <w:jc w:val="both"/>
+        <w:rPr/>
+      </w:pPr>
+      <w:r>
+        <w:rPr/>
+        <w:t xml:space="preserve">1. Una de las diferencia es que las matrices </w:t>
+      </w:r>
+      <w:r>
+        <w:rPr/>
+        <w:t>unidimencionales son estructuras lineales similar a una filas mientras que los multidimencionales tienen dos o mas dimenciones comportandose generalmente en forma de filas y columnas u estructuras mas complejas otra difeencia entre ambos tipos de arreglos es que para acceder a un elemento de un arreglo unidimencional se requiere un indice en los multidimen</w:t>
+      </w:r>
+      <w:r>
+        <w:rPr/>
+        <w:t>s</w:t>
+      </w:r>
+      <w:r>
+        <w:rPr/>
+        <w:t xml:space="preserve">ionales requieren dos. </w:t>
+      </w:r>
+    </w:p>
+    <w:p>
+      <w:pPr>
+        <w:pStyle w:val="Normal"/>
+        <w:bidi w:val="0"/>
+        <w:jc w:val="both"/>
+        <w:rPr/>
+      </w:pPr>
+      <w:r>
+        <w:rPr/>
+      </w:r>
+    </w:p>
+    <w:p>
+      <w:pPr>
+        <w:pStyle w:val="Normal"/>
+        <w:bidi w:val="0"/>
+        <w:jc w:val="both"/>
+        <w:rPr/>
+      </w:pPr>
+      <w:r>
+        <w:rPr/>
+        <w:t>2. Un arreglo bidimencional es un arreglo multidimenci</w:t>
+      </w:r>
+      <w:r>
+        <w:rPr/>
+        <w:t>al por lo cual al referirse a un arreglo bidimencional se estaria haciendo referencia a un tipo de arreglo multidimensional, seria incorrecto decir que son lo mismo ya que un terminno hace referencia a un tipo especifico de arreglo multidimensional</w:t>
+      </w:r>
+    </w:p>
+    <w:p>
+      <w:pPr>
+        <w:pStyle w:val="Normal"/>
+        <w:bidi w:val="0"/>
+        <w:jc w:val="both"/>
+        <w:rPr/>
+      </w:pPr>
+      <w:r>
+        <w:rPr/>
+      </w:r>
+    </w:p>
+    <w:p>
+      <w:pPr>
+        <w:pStyle w:val="Normal"/>
+        <w:bidi w:val="0"/>
+        <w:jc w:val="both"/>
+        <w:rPr/>
+      </w:pPr>
+      <w:r>
+        <w:rPr/>
+        <w:t xml:space="preserve">3. Los arreglos unidimensionales son utililes cuando sus datos son una lista o secuencia simple, para cuando los datos tienen relaciones entre multiples categorias o dimenciones se recomendaria matrices multidimensionales </w:t>
       </w:r>
     </w:p>
     <w:sectPr>

</xml_diff>